<commit_message>
v1.7.7 - Configurazione URL Zimbra e email manutenzione
</commit_message>
<xml_diff>
--- a/RICHIESTA RIPARAZIONE.docx
+++ b/RICHIESTA RIPARAZIONE.docx
@@ -555,6 +555,7 @@
                               </w:rPr>
                               <w:t xml:space="preserve"> </w:t>
                             </w:r>
+                            <w:proofErr w:type="spellStart"/>
                             <w:r>
                               <w:rPr>
                                 <w:color w:val="000000"/>
@@ -562,6 +563,7 @@
                               </w:rPr>
                               <w:t>Cig</w:t>
                             </w:r>
+                            <w:proofErr w:type="spellEnd"/>
                             <w:r>
                               <w:rPr>
                                 <w:color w:val="000000"/>
@@ -1010,6 +1012,7 @@
                         </w:rPr>
                         <w:t xml:space="preserve"> </w:t>
                       </w:r>
+                      <w:proofErr w:type="spellStart"/>
                       <w:r>
                         <w:rPr>
                           <w:color w:val="000000"/>
@@ -1017,6 +1020,7 @@
                         </w:rPr>
                         <w:t>Cig</w:t>
                       </w:r>
+                      <w:proofErr w:type="spellEnd"/>
                       <w:r>
                         <w:rPr>
                           <w:color w:val="000000"/>
@@ -1603,85 +1607,110 @@
                 <w:szCs w:val="24"/>
                 <w:shd w:val="clear" w:color="auto" w:fill="3C3C3C"/>
               </w:rPr>
+              <w:t>{TARGA}, {SIGLA}</w:t>
+            </w:r>
+          </w:p>
+        </w:tc>
+      </w:tr>
+      <w:tr>
+        <w:trPr>
+          <w:trHeight w:val="453"/>
+        </w:trPr>
+        <w:tc>
+          <w:tcPr>
+            <w:tcW w:w="3507" w:type="dxa"/>
+            <w:tcBorders>
+              <w:top w:val="single" w:sz="4" w:space="0" w:color="000000"/>
+              <w:left w:val="single" w:sz="4" w:space="0" w:color="000000"/>
+              <w:bottom w:val="single" w:sz="4" w:space="0" w:color="000000"/>
+              <w:right w:val="single" w:sz="4" w:space="0" w:color="000000"/>
+            </w:tcBorders>
+          </w:tcPr>
+          <w:p>
+            <w:pPr>
+              <w:pStyle w:val="TableParagraph"/>
+              <w:spacing w:before="89"/>
+              <w:ind w:left="107"/>
+              <w:rPr>
+                <w:b/>
+                <w:sz w:val="24"/>
+                <w:szCs w:val="24"/>
+              </w:rPr>
+            </w:pPr>
+            <w:r>
+              <w:rPr>
+                <w:b/>
+                <w:w w:val="80"/>
+                <w:sz w:val="24"/>
+                <w:szCs w:val="24"/>
+              </w:rPr>
+              <w:t>UBICAZIONE</w:t>
+            </w:r>
+            <w:r>
+              <w:rPr>
+                <w:b/>
+                <w:spacing w:val="4"/>
+                <w:sz w:val="24"/>
+                <w:szCs w:val="24"/>
+              </w:rPr>
+              <w:t xml:space="preserve"> </w:t>
+            </w:r>
+            <w:r>
+              <w:rPr>
+                <w:b/>
+                <w:spacing w:val="-2"/>
+                <w:w w:val="90"/>
+                <w:sz w:val="24"/>
+                <w:szCs w:val="24"/>
+              </w:rPr>
+              <w:t>VEICOLO:</w:t>
+            </w:r>
+          </w:p>
+        </w:tc>
+        <w:tc>
+          <w:tcPr>
+            <w:tcW w:w="6305" w:type="dxa"/>
+            <w:tcBorders>
+              <w:top w:val="single" w:sz="4" w:space="0" w:color="000000"/>
+              <w:left w:val="single" w:sz="4" w:space="0" w:color="000000"/>
+              <w:bottom w:val="single" w:sz="4" w:space="0" w:color="000000"/>
+              <w:right w:val="single" w:sz="4" w:space="0" w:color="000000"/>
+            </w:tcBorders>
+          </w:tcPr>
+          <w:p>
+            <w:pPr>
+              <w:tabs>
+                <w:tab w:val="center" w:pos="1134"/>
+              </w:tabs>
+              <w:snapToGrid w:val="0"/>
+              <w:jc w:val="center"/>
+              <w:rPr>
+                <w:sz w:val="24"/>
+                <w:szCs w:val="24"/>
+                <w:shd w:val="clear" w:color="auto" w:fill="FFFFFF"/>
+              </w:rPr>
+            </w:pPr>
+            <w:r>
+              <w:rPr>
+                <w:sz w:val="24"/>
+                <w:szCs w:val="24"/>
+                <w:shd w:val="clear" w:color="auto" w:fill="FFFFFF"/>
+              </w:rPr>
               <w:t>{</w:t>
             </w:r>
             <w:r>
               <w:rPr>
-                <w:rFonts w:ascii="Consolas" w:hAnsi="Consolas"/>
-                <w:color w:val="D0D0D0"/>
                 <w:sz w:val="24"/>
                 <w:szCs w:val="24"/>
-                <w:shd w:val="clear" w:color="auto" w:fill="3C3C3C"/>
-              </w:rPr>
-              <w:t>DESCRIZIONE</w:t>
+                <w:shd w:val="clear" w:color="auto" w:fill="FFFFFF"/>
+              </w:rPr>
+              <w:t>LUOGO</w:t>
             </w:r>
             <w:r>
               <w:rPr>
-                <w:rFonts w:ascii="Consolas" w:hAnsi="Consolas"/>
-                <w:color w:val="D0D0D0"/>
                 <w:sz w:val="24"/>
                 <w:szCs w:val="24"/>
-                <w:shd w:val="clear" w:color="auto" w:fill="3C3C3C"/>
-              </w:rPr>
-              <w:t>}</w:t>
-            </w:r>
-            <w:r>
-              <w:rPr>
-                <w:rFonts w:ascii="Consolas" w:hAnsi="Consolas"/>
-                <w:color w:val="D0D0D0"/>
-                <w:sz w:val="24"/>
-                <w:szCs w:val="24"/>
-                <w:shd w:val="clear" w:color="auto" w:fill="3C3C3C"/>
-              </w:rPr>
-              <w:t xml:space="preserve"> </w:t>
-            </w:r>
-            <w:r>
-              <w:rPr>
-                <w:rFonts w:ascii="Consolas" w:hAnsi="Consolas"/>
-                <w:color w:val="D0D0D0"/>
-                <w:sz w:val="24"/>
-                <w:szCs w:val="24"/>
-                <w:shd w:val="clear" w:color="auto" w:fill="3C3C3C"/>
-              </w:rPr>
-              <w:t>{TARGA}</w:t>
-            </w:r>
-            <w:r>
-              <w:rPr>
-                <w:rFonts w:ascii="Consolas" w:hAnsi="Consolas"/>
-                <w:color w:val="D0D0D0"/>
-                <w:sz w:val="24"/>
-                <w:szCs w:val="24"/>
-                <w:shd w:val="clear" w:color="auto" w:fill="3C3C3C"/>
-              </w:rPr>
-              <w:t xml:space="preserve"> </w:t>
-            </w:r>
-            <w:r>
-              <w:rPr>
-                <w:rFonts w:ascii="Consolas" w:hAnsi="Consolas"/>
-                <w:color w:val="D0D0D0"/>
-                <w:sz w:val="24"/>
-                <w:szCs w:val="24"/>
-                <w:shd w:val="clear" w:color="auto" w:fill="3C3C3C"/>
-              </w:rPr>
-              <w:t>{</w:t>
-            </w:r>
-            <w:r>
-              <w:rPr>
-                <w:rFonts w:ascii="Consolas" w:hAnsi="Consolas"/>
-                <w:color w:val="D0D0D0"/>
-                <w:sz w:val="24"/>
-                <w:szCs w:val="24"/>
-                <w:shd w:val="clear" w:color="auto" w:fill="3C3C3C"/>
-              </w:rPr>
-              <w:t>SIGLA</w:t>
-            </w:r>
-            <w:r>
-              <w:rPr>
-                <w:rFonts w:ascii="Consolas" w:hAnsi="Consolas"/>
-                <w:color w:val="D0D0D0"/>
-                <w:sz w:val="24"/>
-                <w:szCs w:val="24"/>
-                <w:shd w:val="clear" w:color="auto" w:fill="3C3C3C"/>
+                <w:shd w:val="clear" w:color="auto" w:fill="FFFFFF"/>
               </w:rPr>
               <w:t>}</w:t>
             </w:r>
@@ -1716,111 +1745,6 @@
             <w:r>
               <w:rPr>
                 <w:b/>
-                <w:w w:val="80"/>
-                <w:sz w:val="24"/>
-                <w:szCs w:val="24"/>
-              </w:rPr>
-              <w:t>UBICAZIONE</w:t>
-            </w:r>
-            <w:r>
-              <w:rPr>
-                <w:b/>
-                <w:spacing w:val="4"/>
-                <w:sz w:val="24"/>
-                <w:szCs w:val="24"/>
-              </w:rPr>
-              <w:t xml:space="preserve"> </w:t>
-            </w:r>
-            <w:r>
-              <w:rPr>
-                <w:b/>
-                <w:spacing w:val="-2"/>
-                <w:w w:val="90"/>
-                <w:sz w:val="24"/>
-                <w:szCs w:val="24"/>
-              </w:rPr>
-              <w:t>VEICOLO:</w:t>
-            </w:r>
-          </w:p>
-        </w:tc>
-        <w:tc>
-          <w:tcPr>
-            <w:tcW w:w="6305" w:type="dxa"/>
-            <w:tcBorders>
-              <w:top w:val="single" w:sz="4" w:space="0" w:color="000000"/>
-              <w:left w:val="single" w:sz="4" w:space="0" w:color="000000"/>
-              <w:bottom w:val="single" w:sz="4" w:space="0" w:color="000000"/>
-              <w:right w:val="single" w:sz="4" w:space="0" w:color="000000"/>
-            </w:tcBorders>
-          </w:tcPr>
-          <w:p>
-            <w:pPr>
-              <w:tabs>
-                <w:tab w:val="center" w:pos="1134"/>
-              </w:tabs>
-              <w:snapToGrid w:val="0"/>
-              <w:jc w:val="center"/>
-              <w:rPr>
-                <w:sz w:val="24"/>
-                <w:szCs w:val="24"/>
-                <w:shd w:val="clear" w:color="auto" w:fill="FFFFFF"/>
-              </w:rPr>
-            </w:pPr>
-            <w:r>
-              <w:rPr>
-                <w:sz w:val="24"/>
-                <w:szCs w:val="24"/>
-                <w:shd w:val="clear" w:color="auto" w:fill="FFFFFF"/>
-              </w:rPr>
-              <w:t>{</w:t>
-            </w:r>
-            <w:r>
-              <w:rPr>
-                <w:sz w:val="24"/>
-                <w:szCs w:val="24"/>
-                <w:shd w:val="clear" w:color="auto" w:fill="FFFFFF"/>
-              </w:rPr>
-              <w:t>LUOGO</w:t>
-            </w:r>
-            <w:r>
-              <w:rPr>
-                <w:sz w:val="24"/>
-                <w:szCs w:val="24"/>
-                <w:shd w:val="clear" w:color="auto" w:fill="FFFFFF"/>
-              </w:rPr>
-              <w:t>}</w:t>
-            </w:r>
-          </w:p>
-        </w:tc>
-      </w:tr>
-      <w:tr>
-        <w:trPr>
-          <w:trHeight w:val="453"/>
-        </w:trPr>
-        <w:tc>
-          <w:tcPr>
-            <w:tcW w:w="3507" w:type="dxa"/>
-            <w:tcBorders>
-              <w:top w:val="single" w:sz="4" w:space="0" w:color="000000"/>
-              <w:left w:val="single" w:sz="4" w:space="0" w:color="000000"/>
-              <w:bottom w:val="single" w:sz="4" w:space="0" w:color="000000"/>
-              <w:right w:val="single" w:sz="4" w:space="0" w:color="000000"/>
-            </w:tcBorders>
-          </w:tcPr>
-          <w:p>
-            <w:pPr>
-              <w:pStyle w:val="TableParagraph"/>
-              <w:spacing w:before="89"/>
-              <w:ind w:left="107"/>
-              <w:rPr>
-                <w:b/>
-                <w:sz w:val="24"/>
-                <w:szCs w:val="24"/>
-              </w:rPr>
-            </w:pPr>
-            <w:r>
-              <w:rPr>
-                <w:b/>
                 <w:spacing w:val="-2"/>
                 <w:w w:val="90"/>
                 <w:sz w:val="24"/>
@@ -1915,6 +1839,14 @@
                 <w:szCs w:val="24"/>
               </w:rPr>
             </w:pPr>
+            <w:r>
+              <w:rPr>
+                <w:sz w:val="24"/>
+                <w:szCs w:val="24"/>
+                <w:shd w:val="clear" w:color="auto" w:fill="FFFFFF"/>
+              </w:rPr>
+              <w:t>{DATA}</w:t>
+            </w:r>
           </w:p>
         </w:tc>
       </w:tr>
@@ -3138,21 +3070,7 @@
                 <w:sz w:val="24"/>
                 <w:szCs w:val="24"/>
               </w:rPr>
-              <w:t>{</w:t>
-            </w:r>
-            <w:r>
-              <w:rPr>
-                <w:sz w:val="24"/>
-                <w:szCs w:val="24"/>
-              </w:rPr>
-              <w:t>DESCRIZIONE</w:t>
-            </w:r>
-            <w:r>
-              <w:rPr>
-                <w:sz w:val="24"/>
-                <w:szCs w:val="24"/>
-              </w:rPr>
-              <w:t>}</w:t>
+              <w:t>{NOTE_PROBLEMA}</w:t>
             </w:r>
           </w:p>
         </w:tc>

</xml_diff>